<commit_message>
added red marked fields support
</commit_message>
<xml_diff>
--- a/templates/iso27001_stage2.docx
+++ b/templates/iso27001_stage2.docx
@@ -62,19 +62,11 @@
                 <w:szCs w:val="24"/>
               </w:rPr>
             </w:pPr>
-            <w:proofErr w:type="gramStart"/>
             <w:r>
               <w:rPr>
                 <w:rFonts w:cs="Arial"/>
               </w:rPr>
-              <w:t>{{ organizationName</w:t>
-            </w:r>
-            <w:proofErr w:type="gramEnd"/>
-            <w:r>
-              <w:rPr>
-                <w:rFonts w:cs="Arial"/>
-              </w:rPr>
-              <w:t xml:space="preserve"> }}</w:t>
+              <w:t>{{ organizationName }}</w:t>
             </w:r>
           </w:p>
         </w:tc>
@@ -121,19 +113,11 @@
                 <w:szCs w:val="24"/>
               </w:rPr>
             </w:pPr>
-            <w:proofErr w:type="gramStart"/>
             <w:r>
               <w:rPr>
                 <w:rFonts w:cs="Arial"/>
               </w:rPr>
-              <w:t>{{ address</w:t>
-            </w:r>
-            <w:proofErr w:type="gramEnd"/>
-            <w:r>
-              <w:rPr>
-                <w:rFonts w:cs="Arial"/>
-              </w:rPr>
-              <w:t xml:space="preserve"> }}</w:t>
+              <w:t>{{ address }}</w:t>
             </w:r>
           </w:p>
         </w:tc>
@@ -180,13 +164,8 @@
                 <w:szCs w:val="24"/>
               </w:rPr>
             </w:pPr>
-            <w:proofErr w:type="gramStart"/>
-            <w:r>
-              <w:t>{{ siteAddress</w:t>
-            </w:r>
-            <w:proofErr w:type="gramEnd"/>
-            <w:r>
-              <w:t xml:space="preserve"> }}</w:t>
+            <w:r>
+              <w:t>{{ siteAddress }}</w:t>
             </w:r>
           </w:p>
         </w:tc>
@@ -225,9 +204,8 @@
                 <w:sz w:val="24"/>
                 <w:szCs w:val="24"/>
               </w:rPr>
-              <w:t xml:space="preserve">  </w:t>
-            </w:r>
-            <w:proofErr w:type="gramStart"/>
+              <w:t xml:space="preserve">     </w:t>
+            </w:r>
             <w:r>
               <w:rPr>
                 <w:rFonts w:cs="Calibri"/>
@@ -236,9 +214,43 @@
                 <w:sz w:val="24"/>
                 <w:szCs w:val="24"/>
               </w:rPr>
-              <w:t xml:space="preserve">   </w:t>
-            </w:r>
-            <w:r>
+              <w:t>(If Any)</w:t>
+            </w:r>
+          </w:p>
+        </w:tc>
+        <w:tc>
+          <w:tcPr>
+            <w:tcW w:w="6930" w:type="dxa"/>
+            <w:gridSpan w:val="2"/>
+          </w:tcPr>
+          <w:p>
+            <w:pPr>
+              <w:spacing w:after="0" w:line="240" w:lineRule="auto"/>
+              <w:rPr>
+                <w:rFonts w:cs="Calibri"/>
+                <w:sz w:val="24"/>
+                <w:szCs w:val="24"/>
+              </w:rPr>
+            </w:pPr>
+            <w:r>
+              <w:rPr>
+                <w:rFonts w:cs="Calibri"/>
+                <w:sz w:val="24"/>
+                <w:szCs w:val="24"/>
+              </w:rPr>
+              <w:t>{{ virtualSiteDetails}}</w:t>
+            </w:r>
+          </w:p>
+        </w:tc>
+      </w:tr>
+      <w:tr>
+        <w:tc>
+          <w:tcPr>
+            <w:tcW w:w="2808" w:type="dxa"/>
+          </w:tcPr>
+          <w:p>
+            <w:pPr>
+              <w:spacing w:after="0" w:line="240" w:lineRule="auto"/>
               <w:rPr>
                 <w:rFonts w:cs="Calibri"/>
                 <w:b/>
@@ -246,9 +258,7 @@
                 <w:sz w:val="24"/>
                 <w:szCs w:val="24"/>
               </w:rPr>
-              <w:t>(</w:t>
-            </w:r>
-            <w:proofErr w:type="gramEnd"/>
+            </w:pPr>
             <w:r>
               <w:rPr>
                 <w:rFonts w:cs="Calibri"/>
@@ -257,7 +267,7 @@
                 <w:sz w:val="24"/>
                 <w:szCs w:val="24"/>
               </w:rPr>
-              <w:t>If Any)</w:t>
+              <w:t xml:space="preserve">No. of Employees </w:t>
             </w:r>
           </w:p>
         </w:tc>
@@ -270,81 +280,13 @@
             <w:pPr>
               <w:spacing w:after="0" w:line="240" w:lineRule="auto"/>
               <w:rPr>
-                <w:rFonts w:cs="Calibri"/>
-                <w:sz w:val="24"/>
-                <w:szCs w:val="24"/>
-              </w:rPr>
-            </w:pPr>
-            <w:proofErr w:type="gramStart"/>
-            <w:r>
-              <w:rPr>
-                <w:rFonts w:cs="Calibri"/>
-                <w:sz w:val="24"/>
-                <w:szCs w:val="24"/>
-              </w:rPr>
-              <w:t>{{ virtualSiteDetails</w:t>
-            </w:r>
-            <w:proofErr w:type="gramEnd"/>
-            <w:r>
-              <w:rPr>
-                <w:rFonts w:cs="Calibri"/>
-                <w:sz w:val="24"/>
-                <w:szCs w:val="24"/>
-              </w:rPr>
-              <w:t>}}</w:t>
-            </w:r>
-          </w:p>
-        </w:tc>
-      </w:tr>
-      <w:tr>
-        <w:tc>
-          <w:tcPr>
-            <w:tcW w:w="2808" w:type="dxa"/>
-          </w:tcPr>
-          <w:p>
-            <w:pPr>
-              <w:spacing w:after="0" w:line="240" w:lineRule="auto"/>
-              <w:rPr>
-                <w:rFonts w:cs="Calibri"/>
-                <w:b/>
-                <w:bCs/>
-                <w:sz w:val="24"/>
-                <w:szCs w:val="24"/>
-              </w:rPr>
-            </w:pPr>
-            <w:r>
-              <w:rPr>
-                <w:rFonts w:cs="Calibri"/>
-                <w:b/>
-                <w:bCs/>
-                <w:sz w:val="24"/>
-                <w:szCs w:val="24"/>
-              </w:rPr>
-              <w:t xml:space="preserve">No. of Employees </w:t>
-            </w:r>
-          </w:p>
-        </w:tc>
-        <w:tc>
-          <w:tcPr>
-            <w:tcW w:w="6930" w:type="dxa"/>
-            <w:gridSpan w:val="2"/>
-          </w:tcPr>
-          <w:p>
-            <w:pPr>
-              <w:spacing w:after="0" w:line="240" w:lineRule="auto"/>
-              <w:rPr>
                 <w:rFonts w:ascii="Times New Roman" w:hAnsi="Times New Roman"/>
                 <w:sz w:val="24"/>
                 <w:szCs w:val="24"/>
               </w:rPr>
             </w:pPr>
-            <w:proofErr w:type="gramStart"/>
-            <w:r>
-              <w:t>{{ numberOfEmployees</w:t>
-            </w:r>
-            <w:proofErr w:type="gramEnd"/>
-            <w:r>
-              <w:t xml:space="preserve"> }}</w:t>
+            <w:r>
+              <w:t>{{ numberOfEmployees }}</w:t>
             </w:r>
           </w:p>
         </w:tc>
@@ -1242,29 +1184,7 @@
                 <w:sz w:val="24"/>
                 <w:szCs w:val="24"/>
               </w:rPr>
-              <w:t xml:space="preserve">If </w:t>
-            </w:r>
-            <w:proofErr w:type="gramStart"/>
-            <w:r>
-              <w:rPr>
-                <w:rFonts w:cs="Calibri"/>
-                <w:b/>
-                <w:bCs/>
-                <w:sz w:val="24"/>
-                <w:szCs w:val="24"/>
-              </w:rPr>
-              <w:t>Remote( Client</w:t>
-            </w:r>
-            <w:proofErr w:type="gramEnd"/>
-            <w:r>
-              <w:rPr>
-                <w:rFonts w:cs="Calibri"/>
-                <w:b/>
-                <w:bCs/>
-                <w:sz w:val="24"/>
-                <w:szCs w:val="24"/>
-              </w:rPr>
-              <w:t xml:space="preserve"> has all necessory ICT arrangement)</w:t>
+              <w:t>If Remote( Client has all necessory ICT arrangement)</w:t>
             </w:r>
           </w:p>
         </w:tc>
@@ -1518,25 +1438,7 @@
                 <w:i/>
                 <w:color w:val="FF0000"/>
               </w:rPr>
-              <w:t xml:space="preserve">  To evaluate the implementation and effectiveness of the Mgmt. </w:t>
-            </w:r>
-            <w:proofErr w:type="gramStart"/>
-            <w:r>
-              <w:rPr>
-                <w:rFonts w:cs="Calibri"/>
-                <w:i/>
-                <w:color w:val="FF0000"/>
-              </w:rPr>
-              <w:t>System  for</w:t>
-            </w:r>
-            <w:proofErr w:type="gramEnd"/>
-            <w:r>
-              <w:rPr>
-                <w:rFonts w:cs="Calibri"/>
-                <w:i/>
-                <w:color w:val="FF0000"/>
-              </w:rPr>
-              <w:t xml:space="preserve"> Certification     </w:t>
+              <w:t xml:space="preserve">  To evaluate the implementation and effectiveness of the Mgmt. System  for Certification     </w:t>
             </w:r>
           </w:p>
           <w:p>
@@ -1950,22 +1852,8 @@
                 <w:sz w:val="24"/>
                 <w:szCs w:val="24"/>
               </w:rPr>
-              <w:t xml:space="preserve">Is there any deviation from the audit plan if Yes then </w:t>
-            </w:r>
-            <w:proofErr w:type="gramStart"/>
-            <w:r>
-              <w:rPr>
-                <w:rFonts w:cs="Calibri"/>
-                <w:b/>
-                <w:bCs/>
-                <w:iCs/>
-                <w:color w:val="FF0000"/>
-                <w:sz w:val="24"/>
-                <w:szCs w:val="24"/>
-              </w:rPr>
-              <w:t>reasons:</w:t>
-            </w:r>
-            <w:proofErr w:type="gramEnd"/>
+              <w:t>Is there any deviation from the audit plan if Yes then reasons:</w:t>
+            </w:r>
           </w:p>
         </w:tc>
         <w:tc>
@@ -1991,7 +1879,21 @@
                 <w:rFonts w:ascii="Calibri" w:hAnsi="Calibri" w:cs="Calibri"/>
                 <w:iCs/>
               </w:rPr>
-              <w:t>NA</w:t>
+              <w:t>{{</w:t>
+            </w:r>
+            <w:r>
+              <w:rPr>
+                <w:rFonts w:ascii="Calibri" w:hAnsi="Calibri" w:cs="Calibri"/>
+                <w:iCs/>
+              </w:rPr>
+              <w:t>anyDeviationFromAuditPlan</w:t>
+            </w:r>
+            <w:r>
+              <w:rPr>
+                <w:rFonts w:ascii="Calibri" w:hAnsi="Calibri" w:cs="Calibri"/>
+                <w:iCs/>
+              </w:rPr>
+              <w:t>}}</w:t>
             </w:r>
           </w:p>
         </w:tc>
@@ -2028,22 +1930,8 @@
                 <w:sz w:val="24"/>
                 <w:szCs w:val="24"/>
               </w:rPr>
-              <w:t xml:space="preserve">Is there any significant issues impacting on the audit program if Yes then </w:t>
-            </w:r>
-            <w:proofErr w:type="gramStart"/>
-            <w:r>
-              <w:rPr>
-                <w:rFonts w:cs="Calibri"/>
-                <w:b/>
-                <w:bCs/>
-                <w:iCs/>
-                <w:color w:val="FF0000"/>
-                <w:sz w:val="24"/>
-                <w:szCs w:val="24"/>
-              </w:rPr>
-              <w:t>reasons:</w:t>
-            </w:r>
-            <w:proofErr w:type="gramEnd"/>
+              <w:t>Is there any significant issues impacting on the audit program if Yes then reasons:</w:t>
+            </w:r>
           </w:p>
         </w:tc>
         <w:tc>
@@ -2069,7 +1957,21 @@
                 <w:rFonts w:ascii="Calibri" w:hAnsi="Calibri" w:cs="Calibri"/>
                 <w:iCs/>
               </w:rPr>
-              <w:t>NA</w:t>
+              <w:t>{{</w:t>
+            </w:r>
+            <w:r>
+              <w:rPr>
+                <w:rFonts w:ascii="Calibri" w:hAnsi="Calibri" w:cs="Calibri"/>
+                <w:iCs/>
+              </w:rPr>
+              <w:t>anySignificantIssues</w:t>
+            </w:r>
+            <w:r>
+              <w:rPr>
+                <w:rFonts w:ascii="Calibri" w:hAnsi="Calibri" w:cs="Calibri"/>
+                <w:iCs/>
+              </w:rPr>
+              <w:t>}}</w:t>
             </w:r>
           </w:p>
         </w:tc>
@@ -2156,7 +2058,21 @@
                 <w:rFonts w:ascii="Calibri" w:hAnsi="Calibri" w:cs="Calibri"/>
                 <w:iCs/>
               </w:rPr>
-              <w:t>NA</w:t>
+              <w:t>{{</w:t>
+            </w:r>
+            <w:r>
+              <w:rPr>
+                <w:rFonts w:ascii="Calibri" w:hAnsi="Calibri" w:cs="Calibri"/>
+                <w:iCs/>
+              </w:rPr>
+              <w:t>identificationOfAuditTeam</w:t>
+            </w:r>
+            <w:r>
+              <w:rPr>
+                <w:rFonts w:ascii="Calibri" w:hAnsi="Calibri" w:cs="Calibri"/>
+                <w:iCs/>
+              </w:rPr>
+              <w:t>}}</w:t>
             </w:r>
           </w:p>
         </w:tc>
@@ -2193,22 +2109,8 @@
                 <w:sz w:val="24"/>
                 <w:szCs w:val="24"/>
               </w:rPr>
-              <w:t xml:space="preserve">Is there any Significant change, that affects the management system of the client since the last audit took place if Yes then </w:t>
-            </w:r>
-            <w:proofErr w:type="gramStart"/>
-            <w:r>
-              <w:rPr>
-                <w:rFonts w:cs="Calibri"/>
-                <w:b/>
-                <w:bCs/>
-                <w:iCs/>
-                <w:color w:val="FF0000"/>
-                <w:sz w:val="24"/>
-                <w:szCs w:val="24"/>
-              </w:rPr>
-              <w:t>reasons:</w:t>
-            </w:r>
-            <w:proofErr w:type="gramEnd"/>
+              <w:t>Is there any Significant change, that affects the management system of the client since the last audit took place if Yes then reasons:</w:t>
+            </w:r>
           </w:p>
         </w:tc>
         <w:tc>
@@ -2229,7 +2131,21 @@
                 <w:rFonts w:cs="Calibri"/>
                 <w:iCs/>
               </w:rPr>
-              <w:t>NA</w:t>
+              <w:t>{{</w:t>
+            </w:r>
+            <w:r>
+              <w:rPr>
+                <w:rFonts w:cs="Calibri"/>
+                <w:iCs/>
+              </w:rPr>
+              <w:t>anySignificantChange</w:t>
+            </w:r>
+            <w:r>
+              <w:rPr>
+                <w:rFonts w:cs="Calibri"/>
+                <w:iCs/>
+              </w:rPr>
+              <w:t>}}</w:t>
             </w:r>
           </w:p>
         </w:tc>
@@ -4892,9 +4808,8 @@
                 <w:sz w:val="24"/>
                 <w:szCs w:val="24"/>
               </w:rPr>
-              <w:t xml:space="preserve"> Surveillance Audit</w:t>
-            </w:r>
-            <w:proofErr w:type="gramStart"/>
+              <w:t xml:space="preserve"> Surveillance Audit   </w:t>
+            </w:r>
             <w:r>
               <w:rPr>
                 <w:rFonts w:cs="Calibri"/>
@@ -4906,34 +4821,7 @@
                 <w:sz w:val="24"/>
                 <w:szCs w:val="24"/>
               </w:rPr>
-              <w:t xml:space="preserve">   </w:t>
-            </w:r>
-            <w:r>
-              <w:rPr>
-                <w:rFonts w:cs="Calibri"/>
-                <w:b/>
-                <w:i/>
-                <w:iCs/>
-                <w:color w:val="000000"/>
-                <w:spacing w:val="-1"/>
-                <w:sz w:val="24"/>
-                <w:szCs w:val="24"/>
-              </w:rPr>
-              <w:t>(</w:t>
-            </w:r>
-            <w:proofErr w:type="gramEnd"/>
-            <w:r>
-              <w:rPr>
-                <w:rFonts w:cs="Calibri"/>
-                <w:b/>
-                <w:i/>
-                <w:iCs/>
-                <w:color w:val="000000"/>
-                <w:spacing w:val="-1"/>
-                <w:sz w:val="24"/>
-                <w:szCs w:val="24"/>
-              </w:rPr>
-              <w:t>11 months after the initial issuance )</w:t>
+              <w:t>(11 months after the initial issuance )</w:t>
             </w:r>
           </w:p>
         </w:tc>
@@ -18008,27 +17896,7 @@
           <w:sz w:val="20"/>
           <w:szCs w:val="20"/>
         </w:rPr>
-        <w:t xml:space="preserve">Ownership- This Audit Report is the Property of Accurate Global INC. This should be immidiately returned back to AGI in the event of </w:t>
-      </w:r>
-      <w:proofErr w:type="gramStart"/>
-      <w:r>
-        <w:rPr>
-          <w:i/>
-          <w:iCs/>
-          <w:sz w:val="20"/>
-          <w:szCs w:val="20"/>
-        </w:rPr>
-        <w:t>expiry,suspension</w:t>
-      </w:r>
-      <w:proofErr w:type="gramEnd"/>
-      <w:r>
-        <w:rPr>
-          <w:i/>
-          <w:iCs/>
-          <w:sz w:val="20"/>
-          <w:szCs w:val="20"/>
-        </w:rPr>
-        <w:t>, withdrawn, termination of the certification Contract. Any misuse, alteration, counterfeiting of this report shall result in legal actions by AGI.</w:t>
+        <w:t>Ownership- This Audit Report is the Property of Accurate Global INC. This should be immidiately returned back to AGI in the event of expiry,suspension, withdrawn, termination of the certification Contract. Any misuse, alteration, counterfeiting of this report shall result in legal actions by AGI.</w:t>
       </w:r>
     </w:p>
     <w:p>

</xml_diff>